<commit_message>
nuevas correcciones a negritas
</commit_message>
<xml_diff>
--- a/templates/template_contrato.docx
+++ b/templates/template_contrato.docx
@@ -91,12 +91,24 @@
           <w:sz w:val="24"/>
           <w:szCs w:val="24"/>
         </w:rPr>
-        <w:t>En la ciudad de {</w:t>
+        <w:t xml:space="preserve">En la ciudad de </w:t>
+      </w:r>
+      <w:r>
+        <w:rPr>
+          <w:rFonts w:ascii="Century Gothic" w:hAnsi="Century Gothic"/>
+          <w:b/>
+          <w:bCs/>
+          <w:sz w:val="24"/>
+          <w:szCs w:val="24"/>
+        </w:rPr>
+        <w:t>{</w:t>
       </w:r>
       <w:proofErr w:type="spellStart"/>
       <w:r>
         <w:rPr>
           <w:rFonts w:ascii="Century Gothic" w:hAnsi="Century Gothic"/>
+          <w:b/>
+          <w:bCs/>
           <w:sz w:val="24"/>
           <w:szCs w:val="24"/>
         </w:rPr>
@@ -106,15 +118,37 @@
       <w:r>
         <w:rPr>
           <w:rFonts w:ascii="Century Gothic" w:hAnsi="Century Gothic"/>
-          <w:sz w:val="24"/>
-          <w:szCs w:val="24"/>
-        </w:rPr>
-        <w:t>}, a {</w:t>
+          <w:b/>
+          <w:bCs/>
+          <w:sz w:val="24"/>
+          <w:szCs w:val="24"/>
+        </w:rPr>
+        <w:t>}</w:t>
+      </w:r>
+      <w:r>
+        <w:rPr>
+          <w:rFonts w:ascii="Century Gothic" w:hAnsi="Century Gothic"/>
+          <w:sz w:val="24"/>
+          <w:szCs w:val="24"/>
+        </w:rPr>
+        <w:t xml:space="preserve">, a </w:t>
+      </w:r>
+      <w:r>
+        <w:rPr>
+          <w:rFonts w:ascii="Century Gothic" w:hAnsi="Century Gothic"/>
+          <w:b/>
+          <w:bCs/>
+          <w:sz w:val="24"/>
+          <w:szCs w:val="24"/>
+        </w:rPr>
+        <w:t>{</w:t>
       </w:r>
       <w:proofErr w:type="spellStart"/>
       <w:r>
         <w:rPr>
           <w:rFonts w:ascii="Century Gothic" w:hAnsi="Century Gothic"/>
+          <w:b/>
+          <w:bCs/>
           <w:sz w:val="24"/>
           <w:szCs w:val="24"/>
         </w:rPr>
@@ -124,15 +158,37 @@
       <w:r>
         <w:rPr>
           <w:rFonts w:ascii="Century Gothic" w:hAnsi="Century Gothic"/>
-          <w:sz w:val="24"/>
-          <w:szCs w:val="24"/>
-        </w:rPr>
-        <w:t>} días del mes de {</w:t>
+          <w:b/>
+          <w:bCs/>
+          <w:sz w:val="24"/>
+          <w:szCs w:val="24"/>
+        </w:rPr>
+        <w:t>}</w:t>
+      </w:r>
+      <w:r>
+        <w:rPr>
+          <w:rFonts w:ascii="Century Gothic" w:hAnsi="Century Gothic"/>
+          <w:sz w:val="24"/>
+          <w:szCs w:val="24"/>
+        </w:rPr>
+        <w:t xml:space="preserve"> días del mes de </w:t>
+      </w:r>
+      <w:r>
+        <w:rPr>
+          <w:rFonts w:ascii="Century Gothic" w:hAnsi="Century Gothic"/>
+          <w:b/>
+          <w:bCs/>
+          <w:sz w:val="24"/>
+          <w:szCs w:val="24"/>
+        </w:rPr>
+        <w:t>{</w:t>
       </w:r>
       <w:proofErr w:type="spellStart"/>
       <w:r>
         <w:rPr>
           <w:rFonts w:ascii="Century Gothic" w:hAnsi="Century Gothic"/>
+          <w:b/>
+          <w:bCs/>
           <w:sz w:val="24"/>
           <w:szCs w:val="24"/>
         </w:rPr>
@@ -142,15 +198,37 @@
       <w:r>
         <w:rPr>
           <w:rFonts w:ascii="Century Gothic" w:hAnsi="Century Gothic"/>
-          <w:sz w:val="24"/>
-          <w:szCs w:val="24"/>
-        </w:rPr>
-        <w:t>} del {</w:t>
+          <w:b/>
+          <w:bCs/>
+          <w:sz w:val="24"/>
+          <w:szCs w:val="24"/>
+        </w:rPr>
+        <w:t>}</w:t>
+      </w:r>
+      <w:r>
+        <w:rPr>
+          <w:rFonts w:ascii="Century Gothic" w:hAnsi="Century Gothic"/>
+          <w:sz w:val="24"/>
+          <w:szCs w:val="24"/>
+        </w:rPr>
+        <w:t xml:space="preserve"> del </w:t>
+      </w:r>
+      <w:r>
+        <w:rPr>
+          <w:rFonts w:ascii="Century Gothic" w:hAnsi="Century Gothic"/>
+          <w:b/>
+          <w:bCs/>
+          <w:sz w:val="24"/>
+          <w:szCs w:val="24"/>
+        </w:rPr>
+        <w:t>{</w:t>
       </w:r>
       <w:proofErr w:type="spellStart"/>
       <w:r>
         <w:rPr>
           <w:rFonts w:ascii="Century Gothic" w:hAnsi="Century Gothic"/>
+          <w:b/>
+          <w:bCs/>
           <w:sz w:val="24"/>
           <w:szCs w:val="24"/>
         </w:rPr>
@@ -160,10 +238,20 @@
       <w:r>
         <w:rPr>
           <w:rFonts w:ascii="Century Gothic" w:hAnsi="Century Gothic"/>
-          <w:sz w:val="24"/>
-          <w:szCs w:val="24"/>
-        </w:rPr>
-        <w:t>}, comparecen a la suscripción del presente contrato de trabajo productivo (modalidad contractual especial para los Sectores Productivos), por una parte, la compañía ENGLISH-ON-ACADEMY S.A.S., legalmente representada por el señor HUGO GERMAN LOPEZ GOMEZ, en su calidad de PRESIDENTE, a quien en lo sucesivo se podrá denominar como la “EMPLEADORA”, la ”COMPAÑÍA”, la “CONTRATANTE” o la “EMPRESA”; y, por otra, el(la) señor(a)(</w:t>
+          <w:b/>
+          <w:bCs/>
+          <w:sz w:val="24"/>
+          <w:szCs w:val="24"/>
+        </w:rPr>
+        <w:t>}</w:t>
+      </w:r>
+      <w:r>
+        <w:rPr>
+          <w:rFonts w:ascii="Century Gothic" w:hAnsi="Century Gothic"/>
+          <w:sz w:val="24"/>
+          <w:szCs w:val="24"/>
+        </w:rPr>
+        <w:t>, comparecen a la suscripción del presente contrato de trabajo productivo (modalidad contractual especial para los Sectores Productivos), por una parte, la compañía ENGLISH-ON-ACADEMY S.A.S., legalmente representada por el señor HUGO GERMAN LOPEZ GOMEZ, en su calidad de PRESIDENTE, a quien en lo sucesivo se podrá denominar como la “EMPLEADORA”, la ”COMPAÑÍA”, la “CONTRATANTE” o la “EMPRESA”; y, por otra, el(la) señor(a)(</w:t>
       </w:r>
       <w:proofErr w:type="spellStart"/>
       <w:r>
@@ -181,12 +269,24 @@
           <w:sz w:val="24"/>
           <w:szCs w:val="24"/>
         </w:rPr>
-        <w:t>) {</w:t>
+        <w:t xml:space="preserve">) </w:t>
+      </w:r>
+      <w:r>
+        <w:rPr>
+          <w:rFonts w:ascii="Century Gothic" w:hAnsi="Century Gothic"/>
+          <w:b/>
+          <w:bCs/>
+          <w:sz w:val="24"/>
+          <w:szCs w:val="24"/>
+        </w:rPr>
+        <w:t>{</w:t>
       </w:r>
       <w:proofErr w:type="spellStart"/>
       <w:r>
         <w:rPr>
           <w:rFonts w:ascii="Century Gothic" w:hAnsi="Century Gothic"/>
+          <w:b/>
+          <w:bCs/>
           <w:sz w:val="24"/>
           <w:szCs w:val="24"/>
         </w:rPr>
@@ -196,15 +296,37 @@
       <w:r>
         <w:rPr>
           <w:rFonts w:ascii="Century Gothic" w:hAnsi="Century Gothic"/>
-          <w:sz w:val="24"/>
-          <w:szCs w:val="24"/>
-        </w:rPr>
-        <w:t>}, portador(a) de la cédula de ciudadanía/identidad/pasaporte No. {</w:t>
+          <w:b/>
+          <w:bCs/>
+          <w:sz w:val="24"/>
+          <w:szCs w:val="24"/>
+        </w:rPr>
+        <w:t>}</w:t>
+      </w:r>
+      <w:r>
+        <w:rPr>
+          <w:rFonts w:ascii="Century Gothic" w:hAnsi="Century Gothic"/>
+          <w:sz w:val="24"/>
+          <w:szCs w:val="24"/>
+        </w:rPr>
+        <w:t xml:space="preserve">, portador(a) de la cédula de ciudadanía/identidad/pasaporte No. </w:t>
+      </w:r>
+      <w:r>
+        <w:rPr>
+          <w:rFonts w:ascii="Century Gothic" w:hAnsi="Century Gothic"/>
+          <w:b/>
+          <w:bCs/>
+          <w:sz w:val="24"/>
+          <w:szCs w:val="24"/>
+        </w:rPr>
+        <w:t>{</w:t>
       </w:r>
       <w:proofErr w:type="spellStart"/>
       <w:r>
         <w:rPr>
           <w:rFonts w:ascii="Century Gothic" w:hAnsi="Century Gothic"/>
+          <w:b/>
+          <w:bCs/>
           <w:sz w:val="24"/>
           <w:szCs w:val="24"/>
         </w:rPr>
@@ -214,10 +336,20 @@
       <w:r>
         <w:rPr>
           <w:rFonts w:ascii="Century Gothic" w:hAnsi="Century Gothic"/>
-          <w:sz w:val="24"/>
-          <w:szCs w:val="24"/>
-        </w:rPr>
-        <w:t xml:space="preserve">}, a quien en adelante se podrá denominar como </w:t>
+          <w:b/>
+          <w:bCs/>
+          <w:sz w:val="24"/>
+          <w:szCs w:val="24"/>
+        </w:rPr>
+        <w:t>}</w:t>
+      </w:r>
+      <w:r>
+        <w:rPr>
+          <w:rFonts w:ascii="Century Gothic" w:hAnsi="Century Gothic"/>
+          <w:sz w:val="24"/>
+          <w:szCs w:val="24"/>
+        </w:rPr>
+        <w:t xml:space="preserve">, a quien en adelante se podrá denominar como </w:t>
       </w:r>
       <w:proofErr w:type="spellStart"/>
       <w:r>
@@ -281,12 +413,24 @@
           <w:sz w:val="24"/>
           <w:szCs w:val="24"/>
         </w:rPr>
-        <w:t>CLÁUSULA PRIMERA: ANTECEDENTES.- ENGLISH-ON-ACADEMY S.A.S. es una compañía domiciliada en el cantón {</w:t>
+        <w:t xml:space="preserve">CLÁUSULA PRIMERA: ANTECEDENTES.- ENGLISH-ON-ACADEMY S.A.S. es una compañía domiciliada en el cantón </w:t>
+      </w:r>
+      <w:r>
+        <w:rPr>
+          <w:rFonts w:ascii="Century Gothic" w:hAnsi="Century Gothic"/>
+          <w:b/>
+          <w:bCs/>
+          <w:sz w:val="24"/>
+          <w:szCs w:val="24"/>
+        </w:rPr>
+        <w:t>{</w:t>
       </w:r>
       <w:proofErr w:type="spellStart"/>
       <w:r>
         <w:rPr>
           <w:rFonts w:ascii="Century Gothic" w:hAnsi="Century Gothic"/>
+          <w:b/>
+          <w:bCs/>
           <w:sz w:val="24"/>
           <w:szCs w:val="24"/>
         </w:rPr>
@@ -296,10 +440,20 @@
       <w:r>
         <w:rPr>
           <w:rFonts w:ascii="Century Gothic" w:hAnsi="Century Gothic"/>
-          <w:sz w:val="24"/>
-          <w:szCs w:val="24"/>
-        </w:rPr>
-        <w:t>}, con sucursales en las ciudades de Guayaquil y Quito, cuya actividad económica, principal o única, es la ENSEÑANZA DE IDIOMAS Y CLASES DE CONVERSACIÓN; actividad por la cual requiere contratar los servicios lícitos y personales de un(a) trabajador(a) que cumpla sus labores o funciones de acuerdo a lo dispuesto en el Acuerdo Ministerial Nro. MDT-2020-220 que regula la Modalidad Contractual Especial para los Sectores Productivos y sus posteriores reformas, como también bajo las condiciones señaladas en las cláusulas siguientes.</w:t>
+          <w:b/>
+          <w:bCs/>
+          <w:sz w:val="24"/>
+          <w:szCs w:val="24"/>
+        </w:rPr>
+        <w:t>}</w:t>
+      </w:r>
+      <w:r>
+        <w:rPr>
+          <w:rFonts w:ascii="Century Gothic" w:hAnsi="Century Gothic"/>
+          <w:sz w:val="24"/>
+          <w:szCs w:val="24"/>
+        </w:rPr>
+        <w:t>, con sucursales en las ciudades de Guayaquil y Quito, cuya actividad económica, principal o única, es la ENSEÑANZA DE IDIOMAS Y CLASES DE CONVERSACIÓN; actividad por la cual requiere contratar los servicios lícitos y personales de un(a) trabajador(a) que cumpla sus labores o funciones de acuerdo a lo dispuesto en el Acuerdo Ministerial Nro. MDT-2020-220 que regula la Modalidad Contractual Especial para los Sectores Productivos y sus posteriores reformas, como también bajo las condiciones señaladas en las cláusulas siguientes.</w:t>
       </w:r>
     </w:p>
     <w:p>
@@ -449,12 +603,24 @@
           <w:sz w:val="24"/>
           <w:szCs w:val="24"/>
         </w:rPr>
-        <w:t xml:space="preserve"> Con los antecedentes expuestos, la EMPLEADORA contrata los servicios lícitos y personales del (de la) TRABAJADOR(A), con la finalidad que cumpla el cargo de {</w:t>
+        <w:t xml:space="preserve"> Con los antecedentes expuestos, la EMPLEADORA contrata los servicios lícitos y personales del (de la) TRABAJADOR(A), con la finalidad que cumpla el cargo de </w:t>
+      </w:r>
+      <w:r>
+        <w:rPr>
+          <w:rFonts w:ascii="Century Gothic" w:hAnsi="Century Gothic"/>
+          <w:b/>
+          <w:bCs/>
+          <w:sz w:val="24"/>
+          <w:szCs w:val="24"/>
+        </w:rPr>
+        <w:t>{</w:t>
       </w:r>
       <w:proofErr w:type="spellStart"/>
       <w:r>
         <w:rPr>
           <w:rFonts w:ascii="Century Gothic" w:hAnsi="Century Gothic"/>
+          <w:b/>
+          <w:bCs/>
           <w:sz w:val="24"/>
           <w:szCs w:val="24"/>
         </w:rPr>
@@ -464,10 +630,20 @@
       <w:r>
         <w:rPr>
           <w:rFonts w:ascii="Century Gothic" w:hAnsi="Century Gothic"/>
-          <w:sz w:val="24"/>
-          <w:szCs w:val="24"/>
-        </w:rPr>
-        <w:t>}, bajo relación de dependencia de la EMPRESA.</w:t>
+          <w:b/>
+          <w:bCs/>
+          <w:sz w:val="24"/>
+          <w:szCs w:val="24"/>
+        </w:rPr>
+        <w:t>}</w:t>
+      </w:r>
+      <w:r>
+        <w:rPr>
+          <w:rFonts w:ascii="Century Gothic" w:hAnsi="Century Gothic"/>
+          <w:sz w:val="24"/>
+          <w:szCs w:val="24"/>
+        </w:rPr>
+        <w:t>, bajo relación de dependencia de la EMPRESA.</w:t>
       </w:r>
     </w:p>
     <w:p>
@@ -764,12 +940,24 @@
           <w:sz w:val="24"/>
           <w:szCs w:val="24"/>
         </w:rPr>
-        <w:t>De lunes a viernes, el(la) COLABORADOR(A) laborará siete horas diarias, en el horario de {</w:t>
+        <w:t xml:space="preserve">De lunes a viernes, el(la) COLABORADOR(A) laborará siete horas diarias, en el horario de </w:t>
+      </w:r>
+      <w:r>
+        <w:rPr>
+          <w:rFonts w:ascii="Century Gothic" w:hAnsi="Century Gothic"/>
+          <w:b/>
+          <w:bCs/>
+          <w:sz w:val="24"/>
+          <w:szCs w:val="24"/>
+        </w:rPr>
+        <w:t>{</w:t>
       </w:r>
       <w:proofErr w:type="spellStart"/>
       <w:r>
         <w:rPr>
           <w:rFonts w:ascii="Century Gothic" w:hAnsi="Century Gothic"/>
+          <w:b/>
+          <w:bCs/>
           <w:sz w:val="24"/>
           <w:szCs w:val="24"/>
         </w:rPr>
@@ -779,15 +967,37 @@
       <w:r>
         <w:rPr>
           <w:rFonts w:ascii="Century Gothic" w:hAnsi="Century Gothic"/>
-          <w:sz w:val="24"/>
-          <w:szCs w:val="24"/>
-        </w:rPr>
-        <w:t>} a {</w:t>
+          <w:b/>
+          <w:bCs/>
+          <w:sz w:val="24"/>
+          <w:szCs w:val="24"/>
+        </w:rPr>
+        <w:t>}</w:t>
+      </w:r>
+      <w:r>
+        <w:rPr>
+          <w:rFonts w:ascii="Century Gothic" w:hAnsi="Century Gothic"/>
+          <w:sz w:val="24"/>
+          <w:szCs w:val="24"/>
+        </w:rPr>
+        <w:t xml:space="preserve"> a </w:t>
+      </w:r>
+      <w:r>
+        <w:rPr>
+          <w:rFonts w:ascii="Century Gothic" w:hAnsi="Century Gothic"/>
+          <w:b/>
+          <w:bCs/>
+          <w:sz w:val="24"/>
+          <w:szCs w:val="24"/>
+        </w:rPr>
+        <w:t>{</w:t>
       </w:r>
       <w:proofErr w:type="spellStart"/>
       <w:r>
         <w:rPr>
           <w:rFonts w:ascii="Century Gothic" w:hAnsi="Century Gothic"/>
+          <w:b/>
+          <w:bCs/>
           <w:sz w:val="24"/>
           <w:szCs w:val="24"/>
         </w:rPr>
@@ -797,15 +1007,37 @@
       <w:r>
         <w:rPr>
           <w:rFonts w:ascii="Century Gothic" w:hAnsi="Century Gothic"/>
-          <w:sz w:val="24"/>
-          <w:szCs w:val="24"/>
-        </w:rPr>
-        <w:t>}, incluyendo {</w:t>
+          <w:b/>
+          <w:bCs/>
+          <w:sz w:val="24"/>
+          <w:szCs w:val="24"/>
+        </w:rPr>
+        <w:t>}</w:t>
+      </w:r>
+      <w:r>
+        <w:rPr>
+          <w:rFonts w:ascii="Century Gothic" w:hAnsi="Century Gothic"/>
+          <w:sz w:val="24"/>
+          <w:szCs w:val="24"/>
+        </w:rPr>
+        <w:t xml:space="preserve">, incluyendo </w:t>
+      </w:r>
+      <w:r>
+        <w:rPr>
+          <w:rFonts w:ascii="Century Gothic" w:hAnsi="Century Gothic"/>
+          <w:b/>
+          <w:bCs/>
+          <w:sz w:val="24"/>
+          <w:szCs w:val="24"/>
+        </w:rPr>
+        <w:t>{</w:t>
       </w:r>
       <w:proofErr w:type="spellStart"/>
       <w:r>
         <w:rPr>
           <w:rFonts w:ascii="Century Gothic" w:hAnsi="Century Gothic"/>
+          <w:b/>
+          <w:bCs/>
           <w:sz w:val="24"/>
           <w:szCs w:val="24"/>
         </w:rPr>
@@ -815,15 +1047,37 @@
       <w:r>
         <w:rPr>
           <w:rFonts w:ascii="Century Gothic" w:hAnsi="Century Gothic"/>
-          <w:sz w:val="24"/>
-          <w:szCs w:val="24"/>
-        </w:rPr>
-        <w:t>} ({</w:t>
+          <w:b/>
+          <w:bCs/>
+          <w:sz w:val="24"/>
+          <w:szCs w:val="24"/>
+        </w:rPr>
+        <w:t>}</w:t>
+      </w:r>
+      <w:r>
+        <w:rPr>
+          <w:rFonts w:ascii="Century Gothic" w:hAnsi="Century Gothic"/>
+          <w:sz w:val="24"/>
+          <w:szCs w:val="24"/>
+        </w:rPr>
+        <w:t xml:space="preserve"> (</w:t>
+      </w:r>
+      <w:r>
+        <w:rPr>
+          <w:rFonts w:ascii="Century Gothic" w:hAnsi="Century Gothic"/>
+          <w:b/>
+          <w:bCs/>
+          <w:sz w:val="24"/>
+          <w:szCs w:val="24"/>
+        </w:rPr>
+        <w:t>{</w:t>
       </w:r>
       <w:proofErr w:type="spellStart"/>
       <w:r>
         <w:rPr>
           <w:rFonts w:ascii="Century Gothic" w:hAnsi="Century Gothic"/>
+          <w:b/>
+          <w:bCs/>
           <w:sz w:val="24"/>
           <w:szCs w:val="24"/>
         </w:rPr>
@@ -833,10 +1087,56 @@
       <w:r>
         <w:rPr>
           <w:rFonts w:ascii="Century Gothic" w:hAnsi="Century Gothic"/>
-          <w:sz w:val="24"/>
-          <w:szCs w:val="24"/>
-        </w:rPr>
-        <w:t>}) minutos para su descanso o alimentación.</w:t>
+          <w:b/>
+          <w:bCs/>
+          <w:sz w:val="24"/>
+          <w:szCs w:val="24"/>
+        </w:rPr>
+        <w:t>}</w:t>
+      </w:r>
+      <w:r>
+        <w:rPr>
+          <w:rFonts w:ascii="Century Gothic" w:hAnsi="Century Gothic"/>
+          <w:sz w:val="24"/>
+          <w:szCs w:val="24"/>
+        </w:rPr>
+        <w:t xml:space="preserve">) </w:t>
+      </w:r>
+      <w:r>
+        <w:rPr>
+          <w:rFonts w:ascii="Century Gothic" w:hAnsi="Century Gothic"/>
+          <w:b/>
+          <w:bCs/>
+          <w:sz w:val="24"/>
+          <w:szCs w:val="24"/>
+        </w:rPr>
+        <w:t>minutos</w:t>
+      </w:r>
+      <w:r>
+        <w:rPr>
+          <w:rFonts w:ascii="Century Gothic" w:hAnsi="Century Gothic"/>
+          <w:sz w:val="24"/>
+          <w:szCs w:val="24"/>
+        </w:rPr>
+        <w:t xml:space="preserve"> para su </w:t>
+      </w:r>
+      <w:r>
+        <w:rPr>
+          <w:rFonts w:ascii="Century Gothic" w:hAnsi="Century Gothic"/>
+          <w:b/>
+          <w:bCs/>
+          <w:sz w:val="24"/>
+          <w:szCs w:val="24"/>
+        </w:rPr>
+        <w:t>descanso o alimentación</w:t>
+      </w:r>
+      <w:r>
+        <w:rPr>
+          <w:rFonts w:ascii="Century Gothic" w:hAnsi="Century Gothic"/>
+          <w:sz w:val="24"/>
+          <w:szCs w:val="24"/>
+        </w:rPr>
+        <w:t>.</w:t>
       </w:r>
     </w:p>
     <w:p>
@@ -900,12 +1200,24 @@
           <w:sz w:val="24"/>
           <w:szCs w:val="24"/>
         </w:rPr>
-        <w:t>, el(la) TRABAJADOR(A) laborará en el horario de {</w:t>
+        <w:t xml:space="preserve">, el(la) TRABAJADOR(A) laborará en el horario de </w:t>
+      </w:r>
+      <w:r>
+        <w:rPr>
+          <w:rFonts w:ascii="Century Gothic" w:hAnsi="Century Gothic"/>
+          <w:b/>
+          <w:bCs/>
+          <w:sz w:val="24"/>
+          <w:szCs w:val="24"/>
+        </w:rPr>
+        <w:t>{</w:t>
       </w:r>
       <w:proofErr w:type="spellStart"/>
       <w:r>
         <w:rPr>
           <w:rFonts w:ascii="Century Gothic" w:hAnsi="Century Gothic"/>
+          <w:b/>
+          <w:bCs/>
           <w:sz w:val="24"/>
           <w:szCs w:val="24"/>
         </w:rPr>
@@ -915,15 +1227,37 @@
       <w:r>
         <w:rPr>
           <w:rFonts w:ascii="Century Gothic" w:hAnsi="Century Gothic"/>
-          <w:sz w:val="24"/>
-          <w:szCs w:val="24"/>
-        </w:rPr>
-        <w:t>} a {</w:t>
+          <w:b/>
+          <w:bCs/>
+          <w:sz w:val="24"/>
+          <w:szCs w:val="24"/>
+        </w:rPr>
+        <w:t>}</w:t>
+      </w:r>
+      <w:r>
+        <w:rPr>
+          <w:rFonts w:ascii="Century Gothic" w:hAnsi="Century Gothic"/>
+          <w:sz w:val="24"/>
+          <w:szCs w:val="24"/>
+        </w:rPr>
+        <w:t xml:space="preserve"> a </w:t>
+      </w:r>
+      <w:r>
+        <w:rPr>
+          <w:rFonts w:ascii="Century Gothic" w:hAnsi="Century Gothic"/>
+          <w:b/>
+          <w:bCs/>
+          <w:sz w:val="24"/>
+          <w:szCs w:val="24"/>
+        </w:rPr>
+        <w:t>{</w:t>
       </w:r>
       <w:proofErr w:type="spellStart"/>
       <w:r>
         <w:rPr>
           <w:rFonts w:ascii="Century Gothic" w:hAnsi="Century Gothic"/>
+          <w:b/>
+          <w:bCs/>
           <w:sz w:val="24"/>
           <w:szCs w:val="24"/>
         </w:rPr>
@@ -933,10 +1267,74 @@
       <w:r>
         <w:rPr>
           <w:rFonts w:ascii="Century Gothic" w:hAnsi="Century Gothic"/>
-          <w:sz w:val="24"/>
-          <w:szCs w:val="24"/>
-        </w:rPr>
-        <w:t>}, incluyendo treinta (30) minutos para su descanso o alimentación.</w:t>
+          <w:b/>
+          <w:bCs/>
+          <w:sz w:val="24"/>
+          <w:szCs w:val="24"/>
+        </w:rPr>
+        <w:t>}</w:t>
+      </w:r>
+      <w:r>
+        <w:rPr>
+          <w:rFonts w:ascii="Century Gothic" w:hAnsi="Century Gothic"/>
+          <w:sz w:val="24"/>
+          <w:szCs w:val="24"/>
+        </w:rPr>
+        <w:t xml:space="preserve">, incluyendo </w:t>
+      </w:r>
+      <w:r>
+        <w:rPr>
+          <w:rFonts w:ascii="Century Gothic" w:hAnsi="Century Gothic"/>
+          <w:b/>
+          <w:bCs/>
+          <w:sz w:val="24"/>
+          <w:szCs w:val="24"/>
+        </w:rPr>
+        <w:t>treinta (30)</w:t>
+      </w:r>
+      <w:r>
+        <w:rPr>
+          <w:rFonts w:ascii="Century Gothic" w:hAnsi="Century Gothic"/>
+          <w:sz w:val="24"/>
+          <w:szCs w:val="24"/>
+        </w:rPr>
+        <w:t xml:space="preserve"> </w:t>
+      </w:r>
+      <w:r>
+        <w:rPr>
+          <w:rFonts w:ascii="Century Gothic" w:hAnsi="Century Gothic"/>
+          <w:b/>
+          <w:bCs/>
+          <w:sz w:val="24"/>
+          <w:szCs w:val="24"/>
+        </w:rPr>
+        <w:t>minutos</w:t>
+      </w:r>
+      <w:r>
+        <w:rPr>
+          <w:rFonts w:ascii="Century Gothic" w:hAnsi="Century Gothic"/>
+          <w:sz w:val="24"/>
+          <w:szCs w:val="24"/>
+        </w:rPr>
+        <w:t xml:space="preserve"> para su </w:t>
+      </w:r>
+      <w:r>
+        <w:rPr>
+          <w:rFonts w:ascii="Century Gothic" w:hAnsi="Century Gothic"/>
+          <w:b/>
+          <w:bCs/>
+          <w:sz w:val="24"/>
+          <w:szCs w:val="24"/>
+        </w:rPr>
+        <w:t>descanso o alimentación</w:t>
+      </w:r>
+      <w:r>
+        <w:rPr>
+          <w:rFonts w:ascii="Century Gothic" w:hAnsi="Century Gothic"/>
+          <w:sz w:val="24"/>
+          <w:szCs w:val="24"/>
+        </w:rPr>
+        <w:t>.</w:t>
       </w:r>
     </w:p>
     <w:p>
@@ -1143,12 +1541,24 @@
           <w:sz w:val="24"/>
           <w:szCs w:val="24"/>
         </w:rPr>
-        <w:t>Las partes reconocen que el(la) EMPLEADO(A) cumplirá sus labores en el establecimiento u oficina de la EMPRESA, ubicado en {</w:t>
+        <w:t xml:space="preserve">Las partes reconocen que el(la) EMPLEADO(A) cumplirá sus labores en el establecimiento u oficina de la EMPRESA, ubicado en </w:t>
+      </w:r>
+      <w:r>
+        <w:rPr>
+          <w:rFonts w:ascii="Century Gothic" w:hAnsi="Century Gothic"/>
+          <w:b/>
+          <w:bCs/>
+          <w:sz w:val="24"/>
+          <w:szCs w:val="24"/>
+        </w:rPr>
+        <w:t>{</w:t>
       </w:r>
       <w:proofErr w:type="spellStart"/>
       <w:r>
         <w:rPr>
           <w:rFonts w:ascii="Century Gothic" w:hAnsi="Century Gothic"/>
+          <w:b/>
+          <w:bCs/>
           <w:sz w:val="24"/>
           <w:szCs w:val="24"/>
         </w:rPr>
@@ -1158,15 +1568,37 @@
       <w:r>
         <w:rPr>
           <w:rFonts w:ascii="Century Gothic" w:hAnsi="Century Gothic"/>
-          <w:sz w:val="24"/>
-          <w:szCs w:val="24"/>
-        </w:rPr>
-        <w:t>}, en la ciudad de {</w:t>
+          <w:b/>
+          <w:bCs/>
+          <w:sz w:val="24"/>
+          <w:szCs w:val="24"/>
+        </w:rPr>
+        <w:t>}</w:t>
+      </w:r>
+      <w:r>
+        <w:rPr>
+          <w:rFonts w:ascii="Century Gothic" w:hAnsi="Century Gothic"/>
+          <w:sz w:val="24"/>
+          <w:szCs w:val="24"/>
+        </w:rPr>
+        <w:t xml:space="preserve">, en la ciudad de </w:t>
+      </w:r>
+      <w:r>
+        <w:rPr>
+          <w:rFonts w:ascii="Century Gothic" w:hAnsi="Century Gothic"/>
+          <w:b/>
+          <w:bCs/>
+          <w:sz w:val="24"/>
+          <w:szCs w:val="24"/>
+        </w:rPr>
+        <w:t>{</w:t>
       </w:r>
       <w:proofErr w:type="spellStart"/>
       <w:r>
         <w:rPr>
           <w:rFonts w:ascii="Century Gothic" w:hAnsi="Century Gothic"/>
+          <w:b/>
+          <w:bCs/>
           <w:sz w:val="24"/>
           <w:szCs w:val="24"/>
         </w:rPr>
@@ -1176,15 +1608,37 @@
       <w:r>
         <w:rPr>
           <w:rFonts w:ascii="Century Gothic" w:hAnsi="Century Gothic"/>
-          <w:sz w:val="24"/>
-          <w:szCs w:val="24"/>
-        </w:rPr>
-        <w:t>}; sin embargo, en virtud de las labores que cumple para la EMPLEADORA, dicho(a) TRABAJADOR(A), siempre que fuere expresamente requerido por la COMPAÑÍA, deberá trasladarse a los lugares, instalaciones o localidades que la CONTRATANTE requiera, ya sea dentro o fuera de la provincia de {</w:t>
+          <w:b/>
+          <w:bCs/>
+          <w:sz w:val="24"/>
+          <w:szCs w:val="24"/>
+        </w:rPr>
+        <w:t>}</w:t>
+      </w:r>
+      <w:r>
+        <w:rPr>
+          <w:rFonts w:ascii="Century Gothic" w:hAnsi="Century Gothic"/>
+          <w:sz w:val="24"/>
+          <w:szCs w:val="24"/>
+        </w:rPr>
+        <w:t xml:space="preserve">; sin embargo, en virtud de las labores que cumple para la EMPLEADORA, dicho(a) TRABAJADOR(A), siempre que fuere expresamente requerido por la COMPAÑÍA, deberá trasladarse a los lugares, instalaciones o localidades que la CONTRATANTE requiera, ya sea dentro o fuera de la provincia de </w:t>
+      </w:r>
+      <w:r>
+        <w:rPr>
+          <w:rFonts w:ascii="Century Gothic" w:hAnsi="Century Gothic"/>
+          <w:b/>
+          <w:bCs/>
+          <w:sz w:val="24"/>
+          <w:szCs w:val="24"/>
+        </w:rPr>
+        <w:t>{</w:t>
       </w:r>
       <w:proofErr w:type="spellStart"/>
       <w:r>
         <w:rPr>
           <w:rFonts w:ascii="Century Gothic" w:hAnsi="Century Gothic"/>
+          <w:b/>
+          <w:bCs/>
           <w:sz w:val="24"/>
           <w:szCs w:val="24"/>
         </w:rPr>
@@ -1194,10 +1648,20 @@
       <w:r>
         <w:rPr>
           <w:rFonts w:ascii="Century Gothic" w:hAnsi="Century Gothic"/>
-          <w:sz w:val="24"/>
-          <w:szCs w:val="24"/>
-        </w:rPr>
-        <w:t xml:space="preserve">}. En cuyo caso, la COMPAÑÍA deberá entregar, reconocer o reembolsar </w:t>
+          <w:b/>
+          <w:bCs/>
+          <w:sz w:val="24"/>
+          <w:szCs w:val="24"/>
+        </w:rPr>
+        <w:t>}</w:t>
+      </w:r>
+      <w:r>
+        <w:rPr>
+          <w:rFonts w:ascii="Century Gothic" w:hAnsi="Century Gothic"/>
+          <w:sz w:val="24"/>
+          <w:szCs w:val="24"/>
+        </w:rPr>
+        <w:t xml:space="preserve">. En cuyo caso, la COMPAÑÍA deberá entregar, reconocer o reembolsar </w:t>
       </w:r>
       <w:proofErr w:type="gramStart"/>
       <w:r>
@@ -1259,12 +1723,24 @@
           <w:sz w:val="24"/>
           <w:szCs w:val="24"/>
         </w:rPr>
-        <w:t>Para efectos de notificaciones o localización, el(la) TRABAJADOR(A) declara que su lugar de domicilio está ubicado en {</w:t>
+        <w:t xml:space="preserve">Para efectos de notificaciones o localización, el(la) TRABAJADOR(A) declara que su lugar de domicilio está ubicado en </w:t>
+      </w:r>
+      <w:r>
+        <w:rPr>
+          <w:rFonts w:ascii="Century Gothic" w:eastAsia="Century Gothic" w:hAnsi="Century Gothic" w:cs="Century Gothic"/>
+          <w:b/>
+          <w:bCs/>
+          <w:sz w:val="24"/>
+          <w:szCs w:val="24"/>
+        </w:rPr>
+        <w:t>{</w:t>
       </w:r>
       <w:proofErr w:type="spellStart"/>
       <w:r>
         <w:rPr>
           <w:rFonts w:ascii="Century Gothic" w:eastAsia="Century Gothic" w:hAnsi="Century Gothic" w:cs="Century Gothic"/>
+          <w:b/>
+          <w:bCs/>
           <w:sz w:val="24"/>
           <w:szCs w:val="24"/>
         </w:rPr>
@@ -1274,15 +1750,37 @@
       <w:r>
         <w:rPr>
           <w:rFonts w:ascii="Century Gothic" w:eastAsia="Century Gothic" w:hAnsi="Century Gothic" w:cs="Century Gothic"/>
-          <w:sz w:val="24"/>
-          <w:szCs w:val="24"/>
-        </w:rPr>
-        <w:t>} ({</w:t>
+          <w:b/>
+          <w:bCs/>
+          <w:sz w:val="24"/>
+          <w:szCs w:val="24"/>
+        </w:rPr>
+        <w:t>}</w:t>
+      </w:r>
+      <w:r>
+        <w:rPr>
+          <w:rFonts w:ascii="Century Gothic" w:eastAsia="Century Gothic" w:hAnsi="Century Gothic" w:cs="Century Gothic"/>
+          <w:sz w:val="24"/>
+          <w:szCs w:val="24"/>
+        </w:rPr>
+        <w:t xml:space="preserve"> (</w:t>
+      </w:r>
+      <w:r>
+        <w:rPr>
+          <w:rFonts w:ascii="Century Gothic" w:eastAsia="Century Gothic" w:hAnsi="Century Gothic" w:cs="Century Gothic"/>
+          <w:b/>
+          <w:bCs/>
+          <w:sz w:val="24"/>
+          <w:szCs w:val="24"/>
+        </w:rPr>
+        <w:t>{</w:t>
       </w:r>
       <w:proofErr w:type="spellStart"/>
       <w:r>
         <w:rPr>
           <w:rFonts w:ascii="Century Gothic" w:eastAsia="Century Gothic" w:hAnsi="Century Gothic" w:cs="Century Gothic"/>
+          <w:b/>
+          <w:bCs/>
           <w:sz w:val="24"/>
           <w:szCs w:val="24"/>
         </w:rPr>
@@ -1292,15 +1790,37 @@
       <w:r>
         <w:rPr>
           <w:rFonts w:ascii="Century Gothic" w:eastAsia="Century Gothic" w:hAnsi="Century Gothic" w:cs="Century Gothic"/>
-          <w:sz w:val="24"/>
-          <w:szCs w:val="24"/>
-        </w:rPr>
-        <w:t>}), en la ciudad de {</w:t>
+          <w:b/>
+          <w:bCs/>
+          <w:sz w:val="24"/>
+          <w:szCs w:val="24"/>
+        </w:rPr>
+        <w:t>}</w:t>
+      </w:r>
+      <w:r>
+        <w:rPr>
+          <w:rFonts w:ascii="Century Gothic" w:eastAsia="Century Gothic" w:hAnsi="Century Gothic" w:cs="Century Gothic"/>
+          <w:sz w:val="24"/>
+          <w:szCs w:val="24"/>
+        </w:rPr>
+        <w:t xml:space="preserve">), en la ciudad de </w:t>
+      </w:r>
+      <w:r>
+        <w:rPr>
+          <w:rFonts w:ascii="Century Gothic" w:eastAsia="Century Gothic" w:hAnsi="Century Gothic" w:cs="Century Gothic"/>
+          <w:b/>
+          <w:bCs/>
+          <w:sz w:val="24"/>
+          <w:szCs w:val="24"/>
+        </w:rPr>
+        <w:t>{</w:t>
       </w:r>
       <w:proofErr w:type="spellStart"/>
       <w:r>
         <w:rPr>
           <w:rFonts w:ascii="Century Gothic" w:eastAsia="Century Gothic" w:hAnsi="Century Gothic" w:cs="Century Gothic"/>
+          <w:b/>
+          <w:bCs/>
           <w:sz w:val="24"/>
           <w:szCs w:val="24"/>
         </w:rPr>
@@ -1310,15 +1830,37 @@
       <w:r>
         <w:rPr>
           <w:rFonts w:ascii="Century Gothic" w:eastAsia="Century Gothic" w:hAnsi="Century Gothic" w:cs="Century Gothic"/>
-          <w:sz w:val="24"/>
-          <w:szCs w:val="24"/>
-        </w:rPr>
-        <w:t>}, provincia de {</w:t>
+          <w:b/>
+          <w:bCs/>
+          <w:sz w:val="24"/>
+          <w:szCs w:val="24"/>
+        </w:rPr>
+        <w:t>}</w:t>
+      </w:r>
+      <w:r>
+        <w:rPr>
+          <w:rFonts w:ascii="Century Gothic" w:eastAsia="Century Gothic" w:hAnsi="Century Gothic" w:cs="Century Gothic"/>
+          <w:sz w:val="24"/>
+          <w:szCs w:val="24"/>
+        </w:rPr>
+        <w:t xml:space="preserve">, provincia de </w:t>
+      </w:r>
+      <w:r>
+        <w:rPr>
+          <w:rFonts w:ascii="Century Gothic" w:eastAsia="Century Gothic" w:hAnsi="Century Gothic" w:cs="Century Gothic"/>
+          <w:b/>
+          <w:bCs/>
+          <w:sz w:val="24"/>
+          <w:szCs w:val="24"/>
+        </w:rPr>
+        <w:t>{</w:t>
       </w:r>
       <w:proofErr w:type="spellStart"/>
       <w:r>
         <w:rPr>
           <w:rFonts w:ascii="Century Gothic" w:eastAsia="Century Gothic" w:hAnsi="Century Gothic" w:cs="Century Gothic"/>
+          <w:b/>
+          <w:bCs/>
           <w:sz w:val="24"/>
           <w:szCs w:val="24"/>
         </w:rPr>
@@ -1328,59 +1870,81 @@
       <w:r>
         <w:rPr>
           <w:rFonts w:ascii="Century Gothic" w:eastAsia="Century Gothic" w:hAnsi="Century Gothic" w:cs="Century Gothic"/>
-          <w:sz w:val="24"/>
-          <w:szCs w:val="24"/>
-        </w:rPr>
-        <w:t>}.</w:t>
-      </w:r>
-    </w:p>
-    <w:p>
-      <w:pPr>
-        <w:pBdr>
-          <w:top w:val="nil"/>
-          <w:left w:val="nil"/>
-          <w:bottom w:val="nil"/>
-          <w:right w:val="nil"/>
-          <w:between w:val="nil"/>
-        </w:pBdr>
-        <w:spacing w:after="0" w:line="240" w:lineRule="auto"/>
-        <w:jc w:val="both"/>
-        <w:rPr>
-          <w:rFonts w:ascii="Century Gothic" w:eastAsia="Century Gothic" w:hAnsi="Century Gothic" w:cs="Century Gothic"/>
-          <w:sz w:val="24"/>
-          <w:szCs w:val="24"/>
-        </w:rPr>
-      </w:pPr>
-    </w:p>
-    <w:p>
-      <w:pPr>
-        <w:pBdr>
-          <w:top w:val="nil"/>
-          <w:left w:val="nil"/>
-          <w:bottom w:val="nil"/>
-          <w:right w:val="nil"/>
-          <w:between w:val="nil"/>
-        </w:pBdr>
-        <w:spacing w:after="0" w:line="240" w:lineRule="auto"/>
-        <w:jc w:val="both"/>
-        <w:rPr>
-          <w:rFonts w:ascii="Century Gothic" w:eastAsia="Century Gothic" w:hAnsi="Century Gothic" w:cs="Century Gothic"/>
-          <w:sz w:val="24"/>
-          <w:szCs w:val="24"/>
-        </w:rPr>
-      </w:pPr>
-      <w:r>
-        <w:rPr>
-          <w:rFonts w:ascii="Century Gothic" w:eastAsia="Century Gothic" w:hAnsi="Century Gothic" w:cs="Century Gothic"/>
-          <w:sz w:val="24"/>
-          <w:szCs w:val="24"/>
-        </w:rPr>
-        <w:t>De igual manera, el (la) TRABAJADOR(A) declara que su dirección de correo electrónico personal es "{</w:t>
+          <w:b/>
+          <w:bCs/>
+          <w:sz w:val="24"/>
+          <w:szCs w:val="24"/>
+        </w:rPr>
+        <w:t>}</w:t>
+      </w:r>
+      <w:r>
+        <w:rPr>
+          <w:rFonts w:ascii="Century Gothic" w:eastAsia="Century Gothic" w:hAnsi="Century Gothic" w:cs="Century Gothic"/>
+          <w:sz w:val="24"/>
+          <w:szCs w:val="24"/>
+        </w:rPr>
+        <w:t>.</w:t>
+      </w:r>
+    </w:p>
+    <w:p>
+      <w:pPr>
+        <w:pBdr>
+          <w:top w:val="nil"/>
+          <w:left w:val="nil"/>
+          <w:bottom w:val="nil"/>
+          <w:right w:val="nil"/>
+          <w:between w:val="nil"/>
+        </w:pBdr>
+        <w:spacing w:after="0" w:line="240" w:lineRule="auto"/>
+        <w:jc w:val="both"/>
+        <w:rPr>
+          <w:rFonts w:ascii="Century Gothic" w:eastAsia="Century Gothic" w:hAnsi="Century Gothic" w:cs="Century Gothic"/>
+          <w:sz w:val="24"/>
+          <w:szCs w:val="24"/>
+        </w:rPr>
+      </w:pPr>
+    </w:p>
+    <w:p>
+      <w:pPr>
+        <w:pBdr>
+          <w:top w:val="nil"/>
+          <w:left w:val="nil"/>
+          <w:bottom w:val="nil"/>
+          <w:right w:val="nil"/>
+          <w:between w:val="nil"/>
+        </w:pBdr>
+        <w:spacing w:after="0" w:line="240" w:lineRule="auto"/>
+        <w:jc w:val="both"/>
+        <w:rPr>
+          <w:rFonts w:ascii="Century Gothic" w:eastAsia="Century Gothic" w:hAnsi="Century Gothic" w:cs="Century Gothic"/>
+          <w:sz w:val="24"/>
+          <w:szCs w:val="24"/>
+        </w:rPr>
+      </w:pPr>
+      <w:r>
+        <w:rPr>
+          <w:rFonts w:ascii="Century Gothic" w:eastAsia="Century Gothic" w:hAnsi="Century Gothic" w:cs="Century Gothic"/>
+          <w:sz w:val="24"/>
+          <w:szCs w:val="24"/>
+        </w:rPr>
+        <w:t>De igual manera, el (la) TRABAJADOR(A) declara que su dirección de correo electrónico personal es "</w:t>
+      </w:r>
+      <w:r>
+        <w:rPr>
+          <w:rFonts w:ascii="Century Gothic" w:eastAsia="Century Gothic" w:hAnsi="Century Gothic" w:cs="Century Gothic"/>
+          <w:b/>
+          <w:bCs/>
+          <w:sz w:val="24"/>
+          <w:szCs w:val="24"/>
+        </w:rPr>
+        <w:t>{</w:t>
       </w:r>
       <w:proofErr w:type="spellStart"/>
       <w:r>
         <w:rPr>
           <w:rFonts w:ascii="Century Gothic" w:eastAsia="Century Gothic" w:hAnsi="Century Gothic" w:cs="Century Gothic"/>
+          <w:b/>
+          <w:bCs/>
           <w:sz w:val="24"/>
           <w:szCs w:val="24"/>
         </w:rPr>
@@ -1390,10 +1954,20 @@
       <w:r>
         <w:rPr>
           <w:rFonts w:ascii="Century Gothic" w:eastAsia="Century Gothic" w:hAnsi="Century Gothic" w:cs="Century Gothic"/>
-          <w:sz w:val="24"/>
-          <w:szCs w:val="24"/>
-        </w:rPr>
-        <w:t xml:space="preserve">}"; dirección a la cual podrá recibir todo tipo de comunicados, notificaciones y/o citaciones por parte de su EMPLEADORA, autoridades administrativas o judiciales y/o de cualquier funcionario o institución (pública o privada). Adicionalmente, la EMPRESA podrá generar y/o asignar </w:t>
+          <w:b/>
+          <w:bCs/>
+          <w:sz w:val="24"/>
+          <w:szCs w:val="24"/>
+        </w:rPr>
+        <w:t>}</w:t>
+      </w:r>
+      <w:r>
+        <w:rPr>
+          <w:rFonts w:ascii="Century Gothic" w:eastAsia="Century Gothic" w:hAnsi="Century Gothic" w:cs="Century Gothic"/>
+          <w:sz w:val="24"/>
+          <w:szCs w:val="24"/>
+        </w:rPr>
+        <w:t xml:space="preserve">"; dirección a la cual podrá recibir todo tipo de comunicados, notificaciones y/o citaciones por parte de su EMPLEADORA, autoridades administrativas o judiciales y/o de cualquier funcionario o institución (pública o privada). Adicionalmente, la EMPRESA podrá generar y/o asignar </w:t>
       </w:r>
       <w:proofErr w:type="gramStart"/>
       <w:r>
@@ -1528,12 +2102,24 @@
           <w:sz w:val="24"/>
           <w:szCs w:val="24"/>
         </w:rPr>
-        <w:t>a la) TRABAJADOR(A), por la prestación de sus servicios, la remuneración unificada de {</w:t>
+        <w:t xml:space="preserve">a la) TRABAJADOR(A), por la prestación de sus servicios, la remuneración unificada de </w:t>
+      </w:r>
+      <w:r>
+        <w:rPr>
+          <w:rFonts w:ascii="Century Gothic" w:hAnsi="Century Gothic"/>
+          <w:b/>
+          <w:bCs/>
+          <w:sz w:val="24"/>
+          <w:szCs w:val="24"/>
+        </w:rPr>
+        <w:t>{</w:t>
       </w:r>
       <w:proofErr w:type="spellStart"/>
       <w:r>
         <w:rPr>
           <w:rFonts w:ascii="Century Gothic" w:hAnsi="Century Gothic"/>
+          <w:b/>
+          <w:bCs/>
           <w:sz w:val="24"/>
           <w:szCs w:val="24"/>
         </w:rPr>
@@ -1543,6 +2129,8 @@
       <w:r>
         <w:rPr>
           <w:rFonts w:ascii="Century Gothic" w:hAnsi="Century Gothic"/>
+          <w:b/>
+          <w:bCs/>
           <w:sz w:val="24"/>
           <w:szCs w:val="24"/>
         </w:rPr>
@@ -1552,6 +2140,8 @@
       <w:r>
         <w:rPr>
           <w:rFonts w:ascii="Century Gothic" w:hAnsi="Century Gothic"/>
+          <w:b/>
+          <w:bCs/>
           <w:sz w:val="24"/>
           <w:szCs w:val="24"/>
         </w:rPr>
@@ -1561,15 +2151,37 @@
       <w:r>
         <w:rPr>
           <w:rFonts w:ascii="Century Gothic" w:hAnsi="Century Gothic"/>
-          <w:sz w:val="24"/>
-          <w:szCs w:val="24"/>
-        </w:rPr>
-        <w:t>} DÓLARES DE LOS ESTADOS UNIDOS DE AMÉRICA (US${</w:t>
+          <w:b/>
+          <w:bCs/>
+          <w:sz w:val="24"/>
+          <w:szCs w:val="24"/>
+        </w:rPr>
+        <w:t>}</w:t>
+      </w:r>
+      <w:r>
+        <w:rPr>
+          <w:rFonts w:ascii="Century Gothic" w:hAnsi="Century Gothic"/>
+          <w:sz w:val="24"/>
+          <w:szCs w:val="24"/>
+        </w:rPr>
+        <w:t xml:space="preserve"> DÓLARES DE LOS ESTADOS UNIDOS DE AMÉRICA (US$</w:t>
+      </w:r>
+      <w:r>
+        <w:rPr>
+          <w:rFonts w:ascii="Century Gothic" w:hAnsi="Century Gothic"/>
+          <w:b/>
+          <w:bCs/>
+          <w:sz w:val="24"/>
+          <w:szCs w:val="24"/>
+        </w:rPr>
+        <w:t>{</w:t>
       </w:r>
       <w:proofErr w:type="spellStart"/>
       <w:r>
         <w:rPr>
           <w:rFonts w:ascii="Century Gothic" w:hAnsi="Century Gothic"/>
+          <w:b/>
+          <w:bCs/>
           <w:sz w:val="24"/>
           <w:szCs w:val="24"/>
         </w:rPr>
@@ -1579,10 +2191,20 @@
       <w:r>
         <w:rPr>
           <w:rFonts w:ascii="Century Gothic" w:hAnsi="Century Gothic"/>
-          <w:sz w:val="24"/>
-          <w:szCs w:val="24"/>
-        </w:rPr>
-        <w:t>}), más beneficios de ley.</w:t>
+          <w:b/>
+          <w:bCs/>
+          <w:sz w:val="24"/>
+          <w:szCs w:val="24"/>
+        </w:rPr>
+        <w:t>}</w:t>
+      </w:r>
+      <w:r>
+        <w:rPr>
+          <w:rFonts w:ascii="Century Gothic" w:hAnsi="Century Gothic"/>
+          <w:sz w:val="24"/>
+          <w:szCs w:val="24"/>
+        </w:rPr>
+        <w:t>), más beneficios de ley.</w:t>
       </w:r>
     </w:p>
     <w:p>
@@ -1735,12 +2357,24 @@
           <w:sz w:val="24"/>
           <w:szCs w:val="24"/>
         </w:rPr>
-        <w:t xml:space="preserve"> debe movilizarse o trasladarse fuera de la provincia de {</w:t>
+        <w:t xml:space="preserve"> debe movilizarse o trasladarse fuera de la provincia de </w:t>
+      </w:r>
+      <w:r>
+        <w:rPr>
+          <w:rFonts w:ascii="Century Gothic" w:eastAsia="Century Gothic" w:hAnsi="Century Gothic" w:cs="Century Gothic"/>
+          <w:b/>
+          <w:bCs/>
+          <w:sz w:val="24"/>
+          <w:szCs w:val="24"/>
+        </w:rPr>
+        <w:t>{</w:t>
       </w:r>
       <w:proofErr w:type="spellStart"/>
       <w:r>
         <w:rPr>
           <w:rFonts w:ascii="Century Gothic" w:eastAsia="Century Gothic" w:hAnsi="Century Gothic" w:cs="Century Gothic"/>
+          <w:b/>
+          <w:bCs/>
           <w:sz w:val="24"/>
           <w:szCs w:val="24"/>
         </w:rPr>
@@ -1750,10 +2384,20 @@
       <w:r>
         <w:rPr>
           <w:rFonts w:ascii="Century Gothic" w:eastAsia="Century Gothic" w:hAnsi="Century Gothic" w:cs="Century Gothic"/>
-          <w:sz w:val="24"/>
-          <w:szCs w:val="24"/>
-        </w:rPr>
-        <w:t xml:space="preserve">}, la </w:t>
+          <w:b/>
+          <w:bCs/>
+          <w:sz w:val="24"/>
+          <w:szCs w:val="24"/>
+        </w:rPr>
+        <w:t>}</w:t>
+      </w:r>
+      <w:r>
+        <w:rPr>
+          <w:rFonts w:ascii="Century Gothic" w:eastAsia="Century Gothic" w:hAnsi="Century Gothic" w:cs="Century Gothic"/>
+          <w:sz w:val="24"/>
+          <w:szCs w:val="24"/>
+        </w:rPr>
+        <w:t xml:space="preserve">, la </w:t>
       </w:r>
       <w:r>
         <w:rPr>
@@ -5089,12 +5733,24 @@
           <w:sz w:val="24"/>
           <w:szCs w:val="24"/>
         </w:rPr>
-        <w:t xml:space="preserve"> En caso de controversias derivadas de la aplicación o ejecución del presente contrato, las partes declaran expresamente que renuncian a fuero o domicilio distinto y que se someterán, única y exclusivamente, a la jurisdicción y competencia de uno de los jueces multicompetentes del cantón {</w:t>
+        <w:t xml:space="preserve"> En caso de controversias derivadas de la aplicación o ejecución del presente contrato, las partes declaran expresamente que renuncian a fuero o domicilio distinto y que se someterán, única y exclusivamente, a la jurisdicción y competencia de uno de los jueces multicompetentes del cantón </w:t>
+      </w:r>
+      <w:r>
+        <w:rPr>
+          <w:rFonts w:ascii="Century Gothic" w:hAnsi="Century Gothic"/>
+          <w:b/>
+          <w:bCs/>
+          <w:sz w:val="24"/>
+          <w:szCs w:val="24"/>
+        </w:rPr>
+        <w:t>{</w:t>
       </w:r>
       <w:proofErr w:type="spellStart"/>
       <w:r>
         <w:rPr>
           <w:rFonts w:ascii="Century Gothic" w:hAnsi="Century Gothic"/>
+          <w:b/>
+          <w:bCs/>
           <w:sz w:val="24"/>
           <w:szCs w:val="24"/>
         </w:rPr>
@@ -5104,15 +5760,37 @@
       <w:r>
         <w:rPr>
           <w:rFonts w:ascii="Century Gothic" w:hAnsi="Century Gothic"/>
-          <w:sz w:val="24"/>
-          <w:szCs w:val="24"/>
-        </w:rPr>
-        <w:t>}, provincia de {</w:t>
+          <w:b/>
+          <w:bCs/>
+          <w:sz w:val="24"/>
+          <w:szCs w:val="24"/>
+        </w:rPr>
+        <w:t>}</w:t>
+      </w:r>
+      <w:r>
+        <w:rPr>
+          <w:rFonts w:ascii="Century Gothic" w:hAnsi="Century Gothic"/>
+          <w:sz w:val="24"/>
+          <w:szCs w:val="24"/>
+        </w:rPr>
+        <w:t xml:space="preserve">, provincia de </w:t>
+      </w:r>
+      <w:r>
+        <w:rPr>
+          <w:rFonts w:ascii="Century Gothic" w:hAnsi="Century Gothic"/>
+          <w:b/>
+          <w:bCs/>
+          <w:sz w:val="24"/>
+          <w:szCs w:val="24"/>
+        </w:rPr>
+        <w:t>{</w:t>
       </w:r>
       <w:proofErr w:type="spellStart"/>
       <w:r>
         <w:rPr>
           <w:rFonts w:ascii="Century Gothic" w:hAnsi="Century Gothic"/>
+          <w:b/>
+          <w:bCs/>
           <w:sz w:val="24"/>
           <w:szCs w:val="24"/>
         </w:rPr>
@@ -5122,10 +5800,20 @@
       <w:r>
         <w:rPr>
           <w:rFonts w:ascii="Century Gothic" w:hAnsi="Century Gothic"/>
-          <w:sz w:val="24"/>
-          <w:szCs w:val="24"/>
-        </w:rPr>
-        <w:t>}, y a sustanciar su reclamación mediante procedimiento sumario o el que fuere jurídicamente pertinente.</w:t>
+          <w:b/>
+          <w:bCs/>
+          <w:sz w:val="24"/>
+          <w:szCs w:val="24"/>
+        </w:rPr>
+        <w:t>}</w:t>
+      </w:r>
+      <w:r>
+        <w:rPr>
+          <w:rFonts w:ascii="Century Gothic" w:hAnsi="Century Gothic"/>
+          <w:sz w:val="24"/>
+          <w:szCs w:val="24"/>
+        </w:rPr>
+        <w:t>, y a sustanciar su reclamación mediante procedimiento sumario o el que fuere jurídicamente pertinente.</w:t>
       </w:r>
     </w:p>
     <w:p>

</xml_diff>